<commit_message>
Move the 29 height directories into SCF_data/
All single-point SCF data (SCF_data/<h>/R_<R>/) now live in one directory.
Scripts that read them (collect_data.py, merge_reruns.py, binding.py,
fig1.py, plot_pes.py) point there; CSVs are unchanged. README, report and
CLAUDE.md updated. Also adds the git notes to CLAUDE.md.

Co-Authored-By: Claude Opus 5.5 <noreply@anthropic.com>
Claude-Session: https://claude.ai/code/session_01TxJQPZM3ffEBgWAE4JqEVM
</commit_message>
<xml_diff>
--- a/report/PES_report.docx
+++ b/report/PES_report.docx
@@ -765,7 +765,7 @@
           <w:rFonts w:ascii="Consolas" w:hAnsi="Consolas"/>
           <w:sz w:val="19"/>
         </w:rPr>
-        <w:t>&lt;r2&gt;/</w:t>
+        <w:t>SCF_data/&lt;r2&gt;/</w:t>
       </w:r>
       <w:r>
         <w:t xml:space="preserve">, e.g. </w:t>
@@ -775,7 +775,7 @@
           <w:rFonts w:ascii="Consolas" w:hAnsi="Consolas"/>
           <w:sz w:val="19"/>
         </w:rPr>
-        <w:t>1.50/</w:t>
+        <w:t>SCF_data/1.50/</w:t>
       </w:r>
       <w:r>
         <w:t>): it starts at r1 = 8 Å and walks inward, each point restarting from the previous point's wavefunction and charge density. Going inward matters: starting from closed-shell H₂ and walking outward keeps the restricted solution past the point where the H₂ spin symmetry breaks and gives energies that are far too high.</w:t>
@@ -2641,7 +2641,7 @@
                 <w:rFonts w:ascii="Consolas" w:hAnsi="Consolas"/>
                 <w:sz w:val="18"/>
               </w:rPr>
-              <w:t>&lt;r2&gt;/R_&lt;r1&gt;/</w:t>
+              <w:t>SCF_data/&lt;r2&gt;/R_&lt;r1&gt;/</w:t>
             </w:r>
           </w:p>
         </w:tc>
@@ -2702,7 +2702,7 @@
                 <w:rFonts w:ascii="Consolas" w:hAnsi="Consolas"/>
                 <w:sz w:val="18"/>
               </w:rPr>
-              <w:t>&lt;r2&gt;/scan.sh</w:t>
+              <w:t>SCF_data/&lt;r2&gt;/scan.sh</w:t>
             </w:r>
             <w:r>
               <w:rPr>
@@ -2715,20 +2715,7 @@
                 <w:rFonts w:ascii="Consolas" w:hAnsi="Consolas"/>
                 <w:sz w:val="18"/>
               </w:rPr>
-              <w:t>submit</w:t>
-            </w:r>
-            <w:r>
-              <w:rPr>
-                <w:sz w:val="18"/>
-              </w:rPr>
-              <w:t xml:space="preserve">, </w:t>
-            </w:r>
-            <w:r>
-              <w:rPr>
-                <w:rFonts w:ascii="Consolas" w:hAnsi="Consolas"/>
-                <w:sz w:val="18"/>
-              </w:rPr>
-              <w:t>submit_all</w:t>
+              <w:t>submit.example</w:t>
             </w:r>
           </w:p>
         </w:tc>
@@ -2789,7 +2776,7 @@
                 <w:rFonts w:ascii="Consolas" w:hAnsi="Consolas"/>
                 <w:sz w:val="18"/>
               </w:rPr>
-              <w:t>&lt;r2&gt;/&lt;r2&gt;.dat</w:t>
+              <w:t>SCF_data/&lt;r2&gt;/&lt;r2&gt;.dat</w:t>
             </w:r>
           </w:p>
         </w:tc>

</xml_diff>